<commit_message>
Finishing and Cleaning up Task 9/04/2026 -W5 TOH, STr, KSn -W4 doc task
</commit_message>
<xml_diff>
--- a/W4/W4_ST2_LabTask.docx
+++ b/W4/W4_ST2_LabTask.docx
@@ -4,13 +4,22 @@
   <w:body>
     <w:p>
       <w:r>
+        <w:rPr>
+          <w:b/>
+          <w:bCs/>
+        </w:rPr>
         <w:t xml:space="preserve">Task </w:t>
       </w:r>
-      <w:proofErr w:type="gramStart"/>
-      <w:r>
-        <w:t>1:Understanding</w:t>
-      </w:r>
-      <w:proofErr w:type="gramEnd"/>
+      <w:r>
+        <w:rPr>
+          <w:b/>
+          <w:bCs/>
+        </w:rPr>
+        <w:t>1:</w:t>
+      </w:r>
+      <w:r>
+        <w:t xml:space="preserve"> Understanding</w:t>
+      </w:r>
       <w:r>
         <w:t xml:space="preserve"> Simple Data Structures in Python</w:t>
       </w:r>
@@ -48,6 +57,9 @@
         </w:numPr>
       </w:pPr>
       <w:r>
+        <w:rPr>
+          <w:noProof/>
+        </w:rPr>
         <w:drawing>
           <wp:inline distT="0" distB="0" distL="0" distR="0" wp14:anchorId="3A27B4BD" wp14:editId="1CCA4B00">
             <wp:extent cx="5478356" cy="2446020"/>
@@ -106,6 +118,9 @@
         </w:numPr>
       </w:pPr>
       <w:r>
+        <w:rPr>
+          <w:noProof/>
+        </w:rPr>
         <w:drawing>
           <wp:inline distT="0" distB="0" distL="0" distR="0" wp14:anchorId="1B7B55F5" wp14:editId="659D50F3">
             <wp:extent cx="5572903" cy="2095792"/>
@@ -164,6 +179,9 @@
         </w:numPr>
       </w:pPr>
       <w:r>
+        <w:rPr>
+          <w:noProof/>
+        </w:rPr>
         <w:drawing>
           <wp:inline distT="0" distB="0" distL="0" distR="0" wp14:anchorId="5B4B883D" wp14:editId="15A8498E">
             <wp:extent cx="5731510" cy="1376680"/>
@@ -204,7 +222,14 @@
     <w:p/>
     <w:p>
       <w:r>
-        <w:t>Task 2: Understanding Simple Search Algorithms and Measuring their Computational Efficiency in Python</w:t>
+        <w:rPr>
+          <w:b/>
+          <w:bCs/>
+        </w:rPr>
+        <w:t>Task 2:</w:t>
+      </w:r>
+      <w:r>
+        <w:t xml:space="preserve"> Understanding Simple Search Algorithms and Measuring their Computational Efficiency in Python</w:t>
       </w:r>
     </w:p>
     <w:p>
@@ -379,6 +404,9 @@
         </w:numPr>
       </w:pPr>
       <w:r>
+        <w:rPr>
+          <w:noProof/>
+        </w:rPr>
         <w:drawing>
           <wp:inline distT="0" distB="0" distL="0" distR="0" wp14:anchorId="19B58875" wp14:editId="104AD2CC">
             <wp:extent cx="5579110" cy="301640"/>
@@ -425,6 +453,9 @@
         </w:numPr>
       </w:pPr>
       <w:r>
+        <w:rPr>
+          <w:noProof/>
+        </w:rPr>
         <w:drawing>
           <wp:inline distT="0" distB="0" distL="0" distR="0" wp14:anchorId="0E600078" wp14:editId="0050A307">
             <wp:extent cx="5731510" cy="354965"/>
@@ -471,6 +502,9 @@
         </w:numPr>
       </w:pPr>
       <w:r>
+        <w:rPr>
+          <w:noProof/>
+        </w:rPr>
         <w:drawing>
           <wp:inline distT="0" distB="0" distL="0" distR="0" wp14:anchorId="29228254" wp14:editId="2ABB27AB">
             <wp:extent cx="5731510" cy="278765"/>
@@ -517,6 +551,9 @@
         </w:numPr>
       </w:pPr>
       <w:r>
+        <w:rPr>
+          <w:noProof/>
+        </w:rPr>
         <w:drawing>
           <wp:inline distT="0" distB="0" distL="0" distR="0" wp14:anchorId="69CDF745" wp14:editId="1A3A64FB">
             <wp:extent cx="5731510" cy="300990"/>
@@ -581,7 +618,14 @@
     <w:p/>
     <w:p>
       <w:r>
-        <w:t>Task 3: Understanding Simple Sorting Algorithms and Measuring their Computational Efficiency in Python</w:t>
+        <w:rPr>
+          <w:b/>
+          <w:bCs/>
+        </w:rPr>
+        <w:t>Task 3:</w:t>
+      </w:r>
+      <w:r>
+        <w:t xml:space="preserve"> Understanding Simple Sorting Algorithms and Measuring their Computational Efficiency in Python</w:t>
       </w:r>
     </w:p>
     <w:p>
@@ -605,7 +649,41 @@
         </w:numPr>
       </w:pPr>
       <w:r>
-        <w:t>Mm</w:t>
+        <w:drawing>
+          <wp:inline distT="0" distB="0" distL="0" distR="0" wp14:anchorId="6EDC1B92" wp14:editId="0D1A9B6A">
+            <wp:extent cx="5344271" cy="457264"/>
+            <wp:effectExtent l="0" t="0" r="0" b="0"/>
+            <wp:docPr id="1075438579" name="Picture 1"/>
+            <wp:cNvGraphicFramePr>
+              <a:graphicFrameLocks xmlns:a="http://schemas.openxmlformats.org/drawingml/2006/main" noChangeAspect="1"/>
+            </wp:cNvGraphicFramePr>
+            <a:graphic xmlns:a="http://schemas.openxmlformats.org/drawingml/2006/main">
+              <a:graphicData uri="http://schemas.openxmlformats.org/drawingml/2006/picture">
+                <pic:pic xmlns:pic="http://schemas.openxmlformats.org/drawingml/2006/picture">
+                  <pic:nvPicPr>
+                    <pic:cNvPr id="1075438579" name=""/>
+                    <pic:cNvPicPr/>
+                  </pic:nvPicPr>
+                  <pic:blipFill>
+                    <a:blip r:embed="rId13"/>
+                    <a:stretch>
+                      <a:fillRect/>
+                    </a:stretch>
+                  </pic:blipFill>
+                  <pic:spPr>
+                    <a:xfrm>
+                      <a:off x="0" y="0"/>
+                      <a:ext cx="5344271" cy="457264"/>
+                    </a:xfrm>
+                    <a:prstGeom prst="rect">
+                      <a:avLst/>
+                    </a:prstGeom>
+                  </pic:spPr>
+                </pic:pic>
+              </a:graphicData>
+            </a:graphic>
+          </wp:inline>
+        </w:drawing>
       </w:r>
     </w:p>
     <w:p>
@@ -629,7 +707,41 @@
         </w:numPr>
       </w:pPr>
       <w:r>
-        <w:t>Mm</w:t>
+        <w:drawing>
+          <wp:inline distT="0" distB="0" distL="0" distR="0" wp14:anchorId="6B1BEF3A" wp14:editId="29B56DDF">
+            <wp:extent cx="5239481" cy="466790"/>
+            <wp:effectExtent l="0" t="0" r="0" b="9525"/>
+            <wp:docPr id="34811400" name="Picture 1"/>
+            <wp:cNvGraphicFramePr>
+              <a:graphicFrameLocks xmlns:a="http://schemas.openxmlformats.org/drawingml/2006/main" noChangeAspect="1"/>
+            </wp:cNvGraphicFramePr>
+            <a:graphic xmlns:a="http://schemas.openxmlformats.org/drawingml/2006/main">
+              <a:graphicData uri="http://schemas.openxmlformats.org/drawingml/2006/picture">
+                <pic:pic xmlns:pic="http://schemas.openxmlformats.org/drawingml/2006/picture">
+                  <pic:nvPicPr>
+                    <pic:cNvPr id="34811400" name=""/>
+                    <pic:cNvPicPr/>
+                  </pic:nvPicPr>
+                  <pic:blipFill>
+                    <a:blip r:embed="rId14"/>
+                    <a:stretch>
+                      <a:fillRect/>
+                    </a:stretch>
+                  </pic:blipFill>
+                  <pic:spPr>
+                    <a:xfrm>
+                      <a:off x="0" y="0"/>
+                      <a:ext cx="5239481" cy="466790"/>
+                    </a:xfrm>
+                    <a:prstGeom prst="rect">
+                      <a:avLst/>
+                    </a:prstGeom>
+                  </pic:spPr>
+                </pic:pic>
+              </a:graphicData>
+            </a:graphic>
+          </wp:inline>
+        </w:drawing>
       </w:r>
     </w:p>
     <w:p>
@@ -644,16 +756,471 @@
         <w:t>Measure and compare the runtimes of Bubble Sort and Insertion Sort</w:t>
       </w:r>
     </w:p>
-    <w:p>
-      <w:pPr>
-        <w:pStyle w:val="ListParagraph"/>
-        <w:numPr>
-          <w:ilvl w:val="1"/>
-          <w:numId w:val="1"/>
-        </w:numPr>
-      </w:pPr>
-      <w:r>
-        <w:t>mm</w:t>
+    <w:tbl>
+      <w:tblPr>
+        <w:tblStyle w:val="TableGrid"/>
+        <w:tblW w:w="0" w:type="auto"/>
+        <w:tblInd w:w="1440" w:type="dxa"/>
+        <w:tblLook w:val="04A0" w:firstRow="1" w:lastRow="0" w:firstColumn="1" w:lastColumn="0" w:noHBand="0" w:noVBand="1"/>
+      </w:tblPr>
+      <w:tblGrid>
+        <w:gridCol w:w="1744"/>
+        <w:gridCol w:w="1971"/>
+        <w:gridCol w:w="2027"/>
+        <w:gridCol w:w="1834"/>
+      </w:tblGrid>
+      <w:tr>
+        <w:tc>
+          <w:tcPr>
+            <w:tcW w:w="1744" w:type="dxa"/>
+            <w:shd w:val="clear" w:color="auto" w:fill="E8E8E8" w:themeFill="background2"/>
+          </w:tcPr>
+          <w:p>
+            <w:pPr>
+              <w:pStyle w:val="ListParagraph"/>
+              <w:ind w:left="0"/>
+              <w:rPr>
+                <w:b/>
+                <w:bCs/>
+              </w:rPr>
+            </w:pPr>
+            <w:r>
+              <w:rPr>
+                <w:b/>
+                <w:bCs/>
+              </w:rPr>
+              <w:t>Size</w:t>
+            </w:r>
+          </w:p>
+        </w:tc>
+        <w:tc>
+          <w:tcPr>
+            <w:tcW w:w="1971" w:type="dxa"/>
+            <w:shd w:val="clear" w:color="auto" w:fill="E8E8E8" w:themeFill="background2"/>
+          </w:tcPr>
+          <w:p>
+            <w:pPr>
+              <w:pStyle w:val="ListParagraph"/>
+              <w:ind w:left="0"/>
+              <w:rPr>
+                <w:b/>
+                <w:bCs/>
+              </w:rPr>
+            </w:pPr>
+            <w:r>
+              <w:rPr>
+                <w:b/>
+                <w:bCs/>
+              </w:rPr>
+              <w:t>Bubble</w:t>
+            </w:r>
+          </w:p>
+        </w:tc>
+        <w:tc>
+          <w:tcPr>
+            <w:tcW w:w="2027" w:type="dxa"/>
+            <w:shd w:val="clear" w:color="auto" w:fill="E8E8E8" w:themeFill="background2"/>
+          </w:tcPr>
+          <w:p>
+            <w:pPr>
+              <w:pStyle w:val="ListParagraph"/>
+              <w:ind w:left="0"/>
+              <w:rPr>
+                <w:b/>
+                <w:bCs/>
+              </w:rPr>
+            </w:pPr>
+            <w:r>
+              <w:rPr>
+                <w:b/>
+                <w:bCs/>
+              </w:rPr>
+              <w:t>Insertion</w:t>
+            </w:r>
+          </w:p>
+        </w:tc>
+        <w:tc>
+          <w:tcPr>
+            <w:tcW w:w="1834" w:type="dxa"/>
+            <w:shd w:val="clear" w:color="auto" w:fill="E8E8E8" w:themeFill="background2"/>
+          </w:tcPr>
+          <w:p>
+            <w:pPr>
+              <w:pStyle w:val="ListParagraph"/>
+              <w:ind w:left="0"/>
+              <w:rPr>
+                <w:b/>
+                <w:bCs/>
+              </w:rPr>
+            </w:pPr>
+            <w:r>
+              <w:rPr>
+                <w:b/>
+                <w:bCs/>
+              </w:rPr>
+              <w:t>Dif</w:t>
+            </w:r>
+            <w:r>
+              <w:rPr>
+                <w:b/>
+                <w:bCs/>
+              </w:rPr>
+              <w:t>ference</w:t>
+            </w:r>
+          </w:p>
+        </w:tc>
+      </w:tr>
+      <w:tr>
+        <w:tc>
+          <w:tcPr>
+            <w:tcW w:w="1744" w:type="dxa"/>
+          </w:tcPr>
+          <w:p>
+            <w:pPr>
+              <w:pStyle w:val="ListParagraph"/>
+              <w:ind w:left="0"/>
+            </w:pPr>
+            <w:r>
+              <w:t>100</w:t>
+            </w:r>
+          </w:p>
+        </w:tc>
+        <w:tc>
+          <w:tcPr>
+            <w:tcW w:w="1971" w:type="dxa"/>
+          </w:tcPr>
+          <w:p>
+            <w:pPr>
+              <w:pStyle w:val="ListParagraph"/>
+              <w:ind w:left="0"/>
+            </w:pPr>
+            <w:r>
+              <w:t>0.000000</w:t>
+            </w:r>
+          </w:p>
+        </w:tc>
+        <w:tc>
+          <w:tcPr>
+            <w:tcW w:w="2027" w:type="dxa"/>
+          </w:tcPr>
+          <w:p>
+            <w:pPr>
+              <w:pStyle w:val="ListParagraph"/>
+              <w:ind w:left="0"/>
+            </w:pPr>
+            <w:r>
+              <w:t>0.000000</w:t>
+            </w:r>
+          </w:p>
+        </w:tc>
+        <w:tc>
+          <w:tcPr>
+            <w:tcW w:w="1834" w:type="dxa"/>
+          </w:tcPr>
+          <w:p>
+            <w:pPr>
+              <w:pStyle w:val="ListParagraph"/>
+              <w:ind w:left="0"/>
+            </w:pPr>
+            <w:r>
+              <w:t>~</w:t>
+            </w:r>
+            <w:r>
+              <w:t>0</w:t>
+            </w:r>
+            <w:r>
+              <w:t>s</w:t>
+            </w:r>
+          </w:p>
+        </w:tc>
+      </w:tr>
+      <w:tr>
+        <w:tc>
+          <w:tcPr>
+            <w:tcW w:w="1744" w:type="dxa"/>
+          </w:tcPr>
+          <w:p>
+            <w:pPr>
+              <w:pStyle w:val="ListParagraph"/>
+              <w:ind w:left="0"/>
+            </w:pPr>
+            <w:r>
+              <w:t>1 000</w:t>
+            </w:r>
+          </w:p>
+        </w:tc>
+        <w:tc>
+          <w:tcPr>
+            <w:tcW w:w="1971" w:type="dxa"/>
+          </w:tcPr>
+          <w:p>
+            <w:pPr>
+              <w:pStyle w:val="ListParagraph"/>
+              <w:ind w:left="0"/>
+            </w:pPr>
+            <w:r>
+              <w:t>0.033298</w:t>
+            </w:r>
+          </w:p>
+        </w:tc>
+        <w:tc>
+          <w:tcPr>
+            <w:tcW w:w="2027" w:type="dxa"/>
+          </w:tcPr>
+          <w:p>
+            <w:pPr>
+              <w:pStyle w:val="ListParagraph"/>
+              <w:ind w:left="0"/>
+            </w:pPr>
+            <w:r>
+              <w:t>0.015504</w:t>
+            </w:r>
+          </w:p>
+        </w:tc>
+        <w:tc>
+          <w:tcPr>
+            <w:tcW w:w="1834" w:type="dxa"/>
+          </w:tcPr>
+          <w:p>
+            <w:pPr>
+              <w:pStyle w:val="ListParagraph"/>
+              <w:ind w:left="0"/>
+            </w:pPr>
+            <w:r>
+              <w:t>0.017794</w:t>
+            </w:r>
+            <w:r>
+              <w:t>s</w:t>
+            </w:r>
+          </w:p>
+        </w:tc>
+      </w:tr>
+      <w:tr>
+        <w:tc>
+          <w:tcPr>
+            <w:tcW w:w="1744" w:type="dxa"/>
+          </w:tcPr>
+          <w:p>
+            <w:pPr>
+              <w:pStyle w:val="ListParagraph"/>
+              <w:ind w:left="0"/>
+            </w:pPr>
+            <w:r>
+              <w:t>10 000</w:t>
+            </w:r>
+          </w:p>
+        </w:tc>
+        <w:tc>
+          <w:tcPr>
+            <w:tcW w:w="1971" w:type="dxa"/>
+          </w:tcPr>
+          <w:p>
+            <w:pPr>
+              <w:pStyle w:val="ListParagraph"/>
+              <w:ind w:left="0"/>
+            </w:pPr>
+            <w:r>
+              <w:t>3.604012</w:t>
+            </w:r>
+          </w:p>
+        </w:tc>
+        <w:tc>
+          <w:tcPr>
+            <w:tcW w:w="2027" w:type="dxa"/>
+          </w:tcPr>
+          <w:p>
+            <w:pPr>
+              <w:pStyle w:val="ListParagraph"/>
+              <w:ind w:left="0"/>
+            </w:pPr>
+            <w:r>
+              <w:t>1.583155</w:t>
+            </w:r>
+          </w:p>
+        </w:tc>
+        <w:tc>
+          <w:tcPr>
+            <w:tcW w:w="1834" w:type="dxa"/>
+          </w:tcPr>
+          <w:p>
+            <w:pPr>
+              <w:pStyle w:val="ListParagraph"/>
+              <w:ind w:left="0"/>
+            </w:pPr>
+            <w:r>
+              <w:t>2.020857</w:t>
+            </w:r>
+            <w:r>
+              <w:t>s</w:t>
+            </w:r>
+          </w:p>
+        </w:tc>
+      </w:tr>
+      <w:tr>
+        <w:tc>
+          <w:tcPr>
+            <w:tcW w:w="1744" w:type="dxa"/>
+          </w:tcPr>
+          <w:p>
+            <w:pPr>
+              <w:pStyle w:val="ListParagraph"/>
+              <w:ind w:left="0"/>
+            </w:pPr>
+          </w:p>
+        </w:tc>
+        <w:tc>
+          <w:tcPr>
+            <w:tcW w:w="1971" w:type="dxa"/>
+          </w:tcPr>
+          <w:p>
+            <w:pPr>
+              <w:pStyle w:val="ListParagraph"/>
+              <w:ind w:left="0"/>
+            </w:pPr>
+          </w:p>
+        </w:tc>
+        <w:tc>
+          <w:tcPr>
+            <w:tcW w:w="2027" w:type="dxa"/>
+          </w:tcPr>
+          <w:p>
+            <w:pPr>
+              <w:pStyle w:val="ListParagraph"/>
+              <w:ind w:left="0"/>
+            </w:pPr>
+          </w:p>
+        </w:tc>
+        <w:tc>
+          <w:tcPr>
+            <w:tcW w:w="1834" w:type="dxa"/>
+          </w:tcPr>
+          <w:p>
+            <w:pPr>
+              <w:pStyle w:val="ListParagraph"/>
+              <w:ind w:left="0"/>
+            </w:pPr>
+          </w:p>
+        </w:tc>
+      </w:tr>
+    </w:tbl>
+    <w:p>
+      <w:pPr>
+        <w:pStyle w:val="ListParagraph"/>
+        <w:numPr>
+          <w:ilvl w:val="0"/>
+          <w:numId w:val="1"/>
+        </w:numPr>
+      </w:pPr>
+      <w:r>
+        <w:t>Ass Seen on the in the table Insertion sort is much faster than bubble sort with the difference in sort time increasing drastically with the increase of sample size.</w:t>
+      </w:r>
+    </w:p>
+    <w:p>
+      <w:pPr>
+        <w:rPr>
+          <w:b/>
+          <w:bCs/>
+        </w:rPr>
+      </w:pPr>
+      <w:r>
+        <w:rPr>
+          <w:b/>
+          <w:bCs/>
+        </w:rPr>
+        <w:t>Task 4:</w:t>
+      </w:r>
+    </w:p>
+    <w:p>
+      <w:pPr>
+        <w:pStyle w:val="ListParagraph"/>
+        <w:numPr>
+          <w:ilvl w:val="0"/>
+          <w:numId w:val="1"/>
+        </w:numPr>
+      </w:pPr>
+      <w:r>
+        <w:lastRenderedPageBreak/>
+        <w:drawing>
+          <wp:inline distT="0" distB="0" distL="0" distR="0" wp14:anchorId="0A284722" wp14:editId="463DA8F6">
+            <wp:extent cx="5058481" cy="2915057"/>
+            <wp:effectExtent l="0" t="0" r="8890" b="0"/>
+            <wp:docPr id="1027181835" name="Picture 1"/>
+            <wp:cNvGraphicFramePr>
+              <a:graphicFrameLocks xmlns:a="http://schemas.openxmlformats.org/drawingml/2006/main" noChangeAspect="1"/>
+            </wp:cNvGraphicFramePr>
+            <a:graphic xmlns:a="http://schemas.openxmlformats.org/drawingml/2006/main">
+              <a:graphicData uri="http://schemas.openxmlformats.org/drawingml/2006/picture">
+                <pic:pic xmlns:pic="http://schemas.openxmlformats.org/drawingml/2006/picture">
+                  <pic:nvPicPr>
+                    <pic:cNvPr id="1027181835" name=""/>
+                    <pic:cNvPicPr/>
+                  </pic:nvPicPr>
+                  <pic:blipFill>
+                    <a:blip r:embed="rId15"/>
+                    <a:stretch>
+                      <a:fillRect/>
+                    </a:stretch>
+                  </pic:blipFill>
+                  <pic:spPr>
+                    <a:xfrm>
+                      <a:off x="0" y="0"/>
+                      <a:ext cx="5058481" cy="2915057"/>
+                    </a:xfrm>
+                    <a:prstGeom prst="rect">
+                      <a:avLst/>
+                    </a:prstGeom>
+                  </pic:spPr>
+                </pic:pic>
+              </a:graphicData>
+            </a:graphic>
+          </wp:inline>
+        </w:drawing>
+      </w:r>
+    </w:p>
+    <w:p>
+      <w:pPr>
+        <w:pStyle w:val="ListParagraph"/>
+        <w:numPr>
+          <w:ilvl w:val="0"/>
+          <w:numId w:val="1"/>
+        </w:numPr>
+      </w:pPr>
+      <w:r>
+        <w:drawing>
+          <wp:inline distT="0" distB="0" distL="0" distR="0" wp14:anchorId="6E47E4A9" wp14:editId="571C08A6">
+            <wp:extent cx="5325218" cy="2229161"/>
+            <wp:effectExtent l="0" t="0" r="8890" b="0"/>
+            <wp:docPr id="1006980608" name="Picture 1"/>
+            <wp:cNvGraphicFramePr>
+              <a:graphicFrameLocks xmlns:a="http://schemas.openxmlformats.org/drawingml/2006/main" noChangeAspect="1"/>
+            </wp:cNvGraphicFramePr>
+            <a:graphic xmlns:a="http://schemas.openxmlformats.org/drawingml/2006/main">
+              <a:graphicData uri="http://schemas.openxmlformats.org/drawingml/2006/picture">
+                <pic:pic xmlns:pic="http://schemas.openxmlformats.org/drawingml/2006/picture">
+                  <pic:nvPicPr>
+                    <pic:cNvPr id="1006980608" name=""/>
+                    <pic:cNvPicPr/>
+                  </pic:nvPicPr>
+                  <pic:blipFill>
+                    <a:blip r:embed="rId16"/>
+                    <a:stretch>
+                      <a:fillRect/>
+                    </a:stretch>
+                  </pic:blipFill>
+                  <pic:spPr>
+                    <a:xfrm>
+                      <a:off x="0" y="0"/>
+                      <a:ext cx="5325218" cy="2229161"/>
+                    </a:xfrm>
+                    <a:prstGeom prst="rect">
+                      <a:avLst/>
+                    </a:prstGeom>
+                  </pic:spPr>
+                </pic:pic>
+              </a:graphicData>
+            </a:graphic>
+          </wp:inline>
+        </w:drawing>
       </w:r>
     </w:p>
     <w:sectPr>
@@ -1389,6 +1956,7 @@
   <w:style w:type="character" w:default="1" w:styleId="DefaultParagraphFont">
     <w:name w:val="Default Paragraph Font"/>
     <w:uiPriority w:val="1"/>
+    <w:semiHidden/>
     <w:unhideWhenUsed/>
   </w:style>
   <w:style w:type="table" w:default="1" w:styleId="TableNormal">
@@ -1701,6 +2269,25 @@
       <w:color w:val="0F4761" w:themeColor="accent1" w:themeShade="BF"/>
       <w:spacing w:val="5"/>
     </w:rPr>
+  </w:style>
+  <w:style w:type="table" w:styleId="TableGrid">
+    <w:name w:val="Table Grid"/>
+    <w:basedOn w:val="TableNormal"/>
+    <w:uiPriority w:val="39"/>
+    <w:rsid w:val="00877291"/>
+    <w:pPr>
+      <w:spacing w:after="0" w:line="240" w:lineRule="auto"/>
+    </w:pPr>
+    <w:tblPr>
+      <w:tblBorders>
+        <w:top w:val="single" w:sz="4" w:space="0" w:color="auto"/>
+        <w:left w:val="single" w:sz="4" w:space="0" w:color="auto"/>
+        <w:bottom w:val="single" w:sz="4" w:space="0" w:color="auto"/>
+        <w:right w:val="single" w:sz="4" w:space="0" w:color="auto"/>
+        <w:insideH w:val="single" w:sz="4" w:space="0" w:color="auto"/>
+        <w:insideV w:val="single" w:sz="4" w:space="0" w:color="auto"/>
+      </w:tblBorders>
+    </w:tblPr>
   </w:style>
 </w:styles>
 </file>

</xml_diff>

<commit_message>
Task cleaning and finishing 9/04/2026 -Fix merging issues -And checked reports
</commit_message>
<xml_diff>
--- a/W4/W4_ST2_LabTask.docx
+++ b/W4/W4_ST2_LabTask.docx
@@ -649,6 +649,9 @@
         </w:numPr>
       </w:pPr>
       <w:r>
+        <w:rPr>
+          <w:noProof/>
+        </w:rPr>
         <w:drawing>
           <wp:inline distT="0" distB="0" distL="0" distR="0" wp14:anchorId="6EDC1B92" wp14:editId="0D1A9B6A">
             <wp:extent cx="5344271" cy="457264"/>
@@ -707,6 +710,9 @@
         </w:numPr>
       </w:pPr>
       <w:r>
+        <w:rPr>
+          <w:noProof/>
+        </w:rPr>
         <w:drawing>
           <wp:inline distT="0" distB="0" distL="0" distR="0" wp14:anchorId="6B1BEF3A" wp14:editId="29B56DDF">
             <wp:extent cx="5239481" cy="466790"/>
@@ -1112,7 +1118,7 @@
         </w:numPr>
       </w:pPr>
       <w:r>
-        <w:t>Ass Seen on the in the table Insertion sort is much faster than bubble sort with the difference in sort time increasing drastically with the increase of sample size.</w:t>
+        <w:t>As Seen on the in the table Insertion sort is much faster than bubble sort with the difference in sort time increasing drastically with the increase of sample size.</w:t>
       </w:r>
     </w:p>
     <w:p>
@@ -1139,12 +1145,15 @@
         </w:numPr>
       </w:pPr>
       <w:r>
+        <w:rPr>
+          <w:noProof/>
+        </w:rPr>
         <w:lastRenderedPageBreak/>
         <w:drawing>
-          <wp:inline distT="0" distB="0" distL="0" distR="0" wp14:anchorId="0A284722" wp14:editId="463DA8F6">
-            <wp:extent cx="5058481" cy="2915057"/>
-            <wp:effectExtent l="0" t="0" r="8890" b="0"/>
-            <wp:docPr id="1027181835" name="Picture 1"/>
+          <wp:inline distT="0" distB="0" distL="0" distR="0" wp14:anchorId="60FF2C93" wp14:editId="4144A839">
+            <wp:extent cx="5731510" cy="5502275"/>
+            <wp:effectExtent l="0" t="0" r="2540" b="3175"/>
+            <wp:docPr id="1703546174" name="Picture 1"/>
             <wp:cNvGraphicFramePr>
               <a:graphicFrameLocks xmlns:a="http://schemas.openxmlformats.org/drawingml/2006/main" noChangeAspect="1"/>
             </wp:cNvGraphicFramePr>
@@ -1152,7 +1161,7 @@
               <a:graphicData uri="http://schemas.openxmlformats.org/drawingml/2006/picture">
                 <pic:pic xmlns:pic="http://schemas.openxmlformats.org/drawingml/2006/picture">
                   <pic:nvPicPr>
-                    <pic:cNvPr id="1027181835" name=""/>
+                    <pic:cNvPr id="1703546174" name=""/>
                     <pic:cNvPicPr/>
                   </pic:nvPicPr>
                   <pic:blipFill>
@@ -1164,7 +1173,7 @@
                   <pic:spPr>
                     <a:xfrm>
                       <a:off x="0" y="0"/>
-                      <a:ext cx="5058481" cy="2915057"/>
+                      <a:ext cx="5731510" cy="5502275"/>
                     </a:xfrm>
                     <a:prstGeom prst="rect">
                       <a:avLst/>
@@ -1181,46 +1190,44 @@
       <w:pPr>
         <w:pStyle w:val="ListParagraph"/>
         <w:numPr>
-          <w:ilvl w:val="0"/>
-          <w:numId w:val="1"/>
-        </w:numPr>
-      </w:pPr>
-      <w:r>
-        <w:drawing>
-          <wp:inline distT="0" distB="0" distL="0" distR="0" wp14:anchorId="6E47E4A9" wp14:editId="571C08A6">
-            <wp:extent cx="5325218" cy="2229161"/>
-            <wp:effectExtent l="0" t="0" r="8890" b="0"/>
-            <wp:docPr id="1006980608" name="Picture 1"/>
-            <wp:cNvGraphicFramePr>
-              <a:graphicFrameLocks xmlns:a="http://schemas.openxmlformats.org/drawingml/2006/main" noChangeAspect="1"/>
-            </wp:cNvGraphicFramePr>
-            <a:graphic xmlns:a="http://schemas.openxmlformats.org/drawingml/2006/main">
-              <a:graphicData uri="http://schemas.openxmlformats.org/drawingml/2006/picture">
-                <pic:pic xmlns:pic="http://schemas.openxmlformats.org/drawingml/2006/picture">
-                  <pic:nvPicPr>
-                    <pic:cNvPr id="1006980608" name=""/>
-                    <pic:cNvPicPr/>
-                  </pic:nvPicPr>
-                  <pic:blipFill>
-                    <a:blip r:embed="rId16"/>
-                    <a:stretch>
-                      <a:fillRect/>
-                    </a:stretch>
-                  </pic:blipFill>
-                  <pic:spPr>
-                    <a:xfrm>
-                      <a:off x="0" y="0"/>
-                      <a:ext cx="5325218" cy="2229161"/>
-                    </a:xfrm>
-                    <a:prstGeom prst="rect">
-                      <a:avLst/>
-                    </a:prstGeom>
-                  </pic:spPr>
-                </pic:pic>
-              </a:graphicData>
-            </a:graphic>
-          </wp:inline>
-        </w:drawing>
+          <w:ilvl w:val="1"/>
+          <w:numId w:val="1"/>
+        </w:numPr>
+      </w:pPr>
+      <w:r>
+        <w:rPr>
+          <w:noProof/>
+        </w:rPr>
+        <w:t>Compare:</w:t>
+      </w:r>
+    </w:p>
+    <w:p>
+      <w:pPr>
+        <w:pStyle w:val="ListParagraph"/>
+        <w:numPr>
+          <w:ilvl w:val="2"/>
+          <w:numId w:val="1"/>
+        </w:numPr>
+      </w:pPr>
+      <w:r>
+        <w:rPr>
+          <w:noProof/>
+        </w:rPr>
+        <w:t xml:space="preserve">As shown in the terminal output, the </w:t>
+      </w:r>
+      <w:r>
+        <w:rPr>
+          <w:b/>
+          <w:bCs/>
+          <w:noProof/>
+        </w:rPr>
+        <w:t>Insertion-Binary</w:t>
+      </w:r>
+      <w:r>
+        <w:rPr>
+          <w:noProof/>
+        </w:rPr>
+        <w:t xml:space="preserve"> sort and search is the fastest with large data sets. This is expected due to the known time complexeties of the algorithims. </w:t>
       </w:r>
     </w:p>
     <w:sectPr>

</xml_diff>